<commit_message>
Brief: say no reply is on file from Hinkkanen, rather than that he has not replied
Co-Authored-By: Claude Opus 5.5 <noreply@anthropic.com>
Claude-Session: https://claude.ai/code/session_01YTsySEafbpGxYLQMAGUGjT
</commit_message>
<xml_diff>
--- a/chapter1/meetings/2026-10-07_meeting_brief.docx
+++ b/chapter1/meetings/2026-10-07_meeting_brief.docx
@@ -118,7 +118,7 @@
         <w:spacing w:after="60"/>
       </w:pPr>
       <w:r>
-        <w:t>Marko Hinkkanen was invited on 4 September, for the control side of the drive chapter, three days before it became Chapter 12. He has not replied.</w:t>
+        <w:t>Marko Hinkkanen was invited on 4 September, for the control side of the drive chapter, three days before it became Chapter 12. No reply is on file.</w:t>
       </w:r>
     </w:p>
     <w:p>
@@ -2034,7 +2034,7 @@
                 <w:sz w:val="22"/>
                 <w:szCs w:val="22"/>
               </w:rPr>
-              <w:t>invited 4 Sep, for the control side of the drive chapter; no reply</w:t>
+              <w:t>invited 4 Sep, for the control side of the drive chapter; no reply on file</w:t>
             </w:r>
           </w:p>
         </w:tc>

</xml_diff>